<commit_message>
Repair Word Zotero field structure
</commit_message>
<xml_diff>
--- a/docs/manuscript/DigitVA_NPJ_Digital_Medicine_Manuscript.docx
+++ b/docs/manuscript/DigitVA_NPJ_Digital_Medicine_Manuscript.docx
@@ -107,14 +107,21 @@
       <w:r>
         <w:t xml:space="preserve"> </w:t>
       </w:r>
-      <w:r/>
-      <w:fldChar w:fldCharType="begin"/>
-      <w:instrText xml:space="preserve"> ADDIN ZOTERO_ITEM CSL_CITATION {"citationID":"digitva-d5d04eeb162a49ed","properties":{"noteIndex":0},"citationItems":[{"id":"SJLJFQEM","uris":["http://zotero.org/users/337745/items/SJLJFQEM"]},{"id":"M34P3RLJ","uris":["http://zotero.org/users/337745/items/M34P3RLJ"]},{"id":"2CMAM96L","uris":["http://zotero.org/users/337745/items/2CMAM96L"]}],"schema":"https://github.com/citation-style-language/schema/raw/master/csl-citation.json"}</w:instrText>
-      <w:fldChar w:fldCharType="separate"/>
+      <w:r>
+        <w:fldChar w:fldCharType="begin"/>
+      </w:r>
+      <w:r>
+        <w:instrText xml:space="preserve"> ADDIN ZOTERO_ITEM CSL_CITATION {"citationID":"digitva-19d1f8acd24d4bc3","properties":{"noteIndex":0},"citationItems":[{"id":"SJLJFQEM","uris":["http://zotero.org/users/337745/items/SJLJFQEM"]},{"id":"M34P3RLJ","uris":["http://zotero.org/users/337745/items/M34P3RLJ"]},{"id":"2CMAM96L","uris":["http://zotero.org/users/337745/items/2CMAM96L"]}],"schema":"https://github.com/citation-style-language/schema/raw/master/csl-citation.json"}</w:instrText>
+      </w:r>
+      <w:r>
+        <w:fldChar w:fldCharType="separate"/>
+      </w:r>
       <w:r>
         <w:t xml:space="preserve">[1–3]</w:t>
       </w:r>
-      <w:fldChar w:fldCharType="end"/>
+      <w:r>
+        <w:fldChar w:fldCharType="end"/>
+      </w:r>
     </w:p>
     <w:p>
       <w:r>
@@ -123,14 +130,21 @@
       <w:r>
         <w:t xml:space="preserve"> </w:t>
       </w:r>
-      <w:r/>
-      <w:fldChar w:fldCharType="begin"/>
-      <w:instrText xml:space="preserve"> ADDIN ZOTERO_ITEM CSL_CITATION {"citationID":"digitva-6759435522344526","properties":{"noteIndex":0},"citationItems":[{"id":"2Y48HNZL","uris":["http://zotero.org/users/337745/items/2Y48HNZL"]},{"id":"XX42INSZ","uris":["http://zotero.org/users/337745/items/XX42INSZ"]},{"id":"8AB46D42","uris":["http://zotero.org/users/337745/items/8AB46D42"]},{"id":"GW7XT3RM","uris":["http://zotero.org/users/337745/items/GW7XT3RM"]}],"schema":"https://github.com/citation-style-language/schema/raw/master/csl-citation.json"}</w:instrText>
-      <w:fldChar w:fldCharType="separate"/>
+      <w:r>
+        <w:fldChar w:fldCharType="begin"/>
+      </w:r>
+      <w:r>
+        <w:instrText xml:space="preserve"> ADDIN ZOTERO_ITEM CSL_CITATION {"citationID":"digitva-ede4fed4f5294c28","properties":{"noteIndex":0},"citationItems":[{"id":"2Y48HNZL","uris":["http://zotero.org/users/337745/items/2Y48HNZL"]},{"id":"XX42INSZ","uris":["http://zotero.org/users/337745/items/XX42INSZ"]},{"id":"8AB46D42","uris":["http://zotero.org/users/337745/items/8AB46D42"]},{"id":"GW7XT3RM","uris":["http://zotero.org/users/337745/items/GW7XT3RM"]}],"schema":"https://github.com/citation-style-language/schema/raw/master/csl-citation.json"}</w:instrText>
+      </w:r>
+      <w:r>
+        <w:fldChar w:fldCharType="separate"/>
+      </w:r>
       <w:r>
         <w:t xml:space="preserve">[4–7]</w:t>
       </w:r>
-      <w:fldChar w:fldCharType="end"/>
+      <w:r>
+        <w:fldChar w:fldCharType="end"/>
+      </w:r>
     </w:p>
     <w:p>
       <w:r>
@@ -1504,14 +1518,21 @@
       <w:r>
         <w:t xml:space="preserve"> </w:t>
       </w:r>
-      <w:r/>
-      <w:fldChar w:fldCharType="begin"/>
-      <w:instrText xml:space="preserve"> ADDIN ZOTERO_ITEM CSL_CITATION {"citationID":"digitva-ba64be7634e64a5d","properties":{"noteIndex":0},"citationItems":[{"id":"2Y48HNZL","uris":["http://zotero.org/users/337745/items/2Y48HNZL"]},{"id":"GW7XT3RM","uris":["http://zotero.org/users/337745/items/GW7XT3RM"]}],"schema":"https://github.com/citation-style-language/schema/raw/master/csl-citation.json"}</w:instrText>
-      <w:fldChar w:fldCharType="separate"/>
+      <w:r>
+        <w:fldChar w:fldCharType="begin"/>
+      </w:r>
+      <w:r>
+        <w:instrText xml:space="preserve"> ADDIN ZOTERO_ITEM CSL_CITATION {"citationID":"digitva-5109b2db886d43fb","properties":{"noteIndex":0},"citationItems":[{"id":"2Y48HNZL","uris":["http://zotero.org/users/337745/items/2Y48HNZL"]},{"id":"GW7XT3RM","uris":["http://zotero.org/users/337745/items/GW7XT3RM"]}],"schema":"https://github.com/citation-style-language/schema/raw/master/csl-citation.json"}</w:instrText>
+      </w:r>
+      <w:r>
+        <w:fldChar w:fldCharType="separate"/>
+      </w:r>
       <w:r>
         <w:t xml:space="preserve">[4,7]</w:t>
       </w:r>
-      <w:fldChar w:fldCharType="end"/>
+      <w:r>
+        <w:fldChar w:fldCharType="end"/>
+      </w:r>
     </w:p>
     <w:p>
       <w:pPr>
@@ -1572,14 +1593,21 @@
       <w:r>
         <w:t xml:space="preserve"> </w:t>
       </w:r>
-      <w:r/>
-      <w:fldChar w:fldCharType="begin"/>
-      <w:instrText xml:space="preserve"> ADDIN ZOTERO_ITEM CSL_CITATION {"citationID":"digitva-22e7e9f9f01249c5","properties":{"noteIndex":0},"citationItems":[{"id":"26YTFYJN","uris":["http://zotero.org/users/337745/items/26YTFYJN"]},{"id":"L4RYIGF4","uris":["http://zotero.org/users/337745/items/L4RYIGF4"]}],"schema":"https://github.com/citation-style-language/schema/raw/master/csl-citation.json"}</w:instrText>
-      <w:fldChar w:fldCharType="separate"/>
+      <w:r>
+        <w:fldChar w:fldCharType="begin"/>
+      </w:r>
+      <w:r>
+        <w:instrText xml:space="preserve"> ADDIN ZOTERO_ITEM CSL_CITATION {"citationID":"digitva-975aa369f3284f34","properties":{"noteIndex":0},"citationItems":[{"id":"26YTFYJN","uris":["http://zotero.org/users/337745/items/26YTFYJN"]},{"id":"L4RYIGF4","uris":["http://zotero.org/users/337745/items/L4RYIGF4"]}],"schema":"https://github.com/citation-style-language/schema/raw/master/csl-citation.json"}</w:instrText>
+      </w:r>
+      <w:r>
+        <w:fldChar w:fldCharType="separate"/>
+      </w:r>
       <w:r>
         <w:t xml:space="preserve">[8,9]</w:t>
       </w:r>
-      <w:fldChar w:fldCharType="end"/>
+      <w:r>
+        <w:fldChar w:fldCharType="end"/>
+      </w:r>
     </w:p>
     <w:p>
       <w:pPr>
@@ -1606,14 +1634,21 @@
       <w:r>
         <w:t xml:space="preserve"> </w:t>
       </w:r>
-      <w:r/>
-      <w:fldChar w:fldCharType="begin"/>
-      <w:instrText xml:space="preserve"> ADDIN ZOTERO_ITEM CSL_CITATION {"citationID":"digitva-5848a8ec8d4b4d46","properties":{"noteIndex":0},"citationItems":[{"id":"WZB5UKME","uris":["http://zotero.org/users/337745/items/WZB5UKME"]}],"schema":"https://github.com/citation-style-language/schema/raw/master/csl-citation.json"}</w:instrText>
-      <w:fldChar w:fldCharType="separate"/>
+      <w:r>
+        <w:fldChar w:fldCharType="begin"/>
+      </w:r>
+      <w:r>
+        <w:instrText xml:space="preserve"> ADDIN ZOTERO_ITEM CSL_CITATION {"citationID":"digitva-a376d95ae21a47fb","properties":{"noteIndex":0},"citationItems":[{"id":"WZB5UKME","uris":["http://zotero.org/users/337745/items/WZB5UKME"]}],"schema":"https://github.com/citation-style-language/schema/raw/master/csl-citation.json"}</w:instrText>
+      </w:r>
+      <w:r>
+        <w:fldChar w:fldCharType="separate"/>
+      </w:r>
       <w:r>
         <w:t xml:space="preserve">[10]</w:t>
       </w:r>
-      <w:fldChar w:fldCharType="end"/>
+      <w:r>
+        <w:fldChar w:fldCharType="end"/>
+      </w:r>
     </w:p>
     <w:p>
       <w:pPr>
@@ -1705,10 +1740,15 @@
       <w:pPr>
         <w:jc w:val="left"/>
       </w:pPr>
-      <w:r/>
-      <w:fldChar w:fldCharType="begin"/>
-      <w:instrText xml:space="preserve"> ADDIN ZOTERO_BIBL {"uncited":[],"omitted":[],"custom":[]}</w:instrText>
-      <w:fldChar w:fldCharType="separate"/>
+      <w:r>
+        <w:fldChar w:fldCharType="begin"/>
+      </w:r>
+      <w:r>
+        <w:instrText xml:space="preserve"> ADDIN ZOTERO_BIBL {"uncited":[],"omitted":[],"custom":[]}</w:instrText>
+      </w:r>
+      <w:r>
+        <w:fldChar w:fldCharType="separate"/>
+      </w:r>
       <w:r>
         <w:t xml:space="preserve">1. Riley I, Flaxman AD, Clark SJ, et al. The WHO 2016 verbal autopsy instrument: an international standard suitable for automated analysis by InterVA, InSilicoVA, and Tariff 2.0. PLoS Med. 2018;15:e1002486. doi:10.1371/journal.pmed.1002486.</w:t>
         <w:br/>
@@ -1730,7 +1770,9 @@
         <w:br/>
         <w:t xml:space="preserve">10. World Health Organization. ICD-11 for Mortality and Morbidity Statistics. https://icd.who.int/.</w:t>
       </w:r>
-      <w:fldChar w:fldCharType="end"/>
+      <w:r>
+        <w:fldChar w:fldCharType="end"/>
+      </w:r>
     </w:p>
     <w:p>
       <w:r>

</xml_diff>